<commit_message>
Ajout du quiz mobile
</commit_message>
<xml_diff>
--- a/contexte_professionnel/projet_1/Parti_chris_continuation.docx
+++ b/contexte_professionnel/projet_1/Parti_chris_continuation.docx
@@ -29,13 +29,13 @@
         <mc:AlternateContent>
           <mc:Choice Requires="wps">
             <w:drawing>
-              <wp:anchor behindDoc="0" distT="38100" distB="26670" distL="0" distR="48895" simplePos="0" locked="0" layoutInCell="0" allowOverlap="1" relativeHeight="5" wp14:anchorId="7947523E">
+              <wp:anchor behindDoc="0" distT="635" distB="8255" distL="5715" distR="635" simplePos="0" locked="0" layoutInCell="0" allowOverlap="1" relativeHeight="5" wp14:anchorId="7947523E">
                 <wp:simplePos x="0" y="0"/>
                 <wp:positionH relativeFrom="column">
-                  <wp:posOffset>3709035</wp:posOffset>
+                  <wp:posOffset>3708400</wp:posOffset>
                 </wp:positionH>
                 <wp:positionV relativeFrom="paragraph">
-                  <wp:posOffset>309245</wp:posOffset>
+                  <wp:posOffset>307975</wp:posOffset>
                 </wp:positionV>
                 <wp:extent cx="1666240" cy="1116330"/>
                 <wp:effectExtent l="5715" t="635" r="635" b="8255"/>
@@ -86,7 +86,7 @@
                 <v:stroke joinstyle="miter"/>
                 <v:path gradientshapeok="t" o:connecttype="rect" textboxrect="0,0,21600,21600"/>
               </v:shapetype>
-              <v:shape id="shape_0" ID="Connecteur droit avec flèche 4" stroked="t" o:allowincell="f" style="position:absolute;margin-left:292.05pt;margin-top:24.35pt;width:131.15pt;height:87.85pt;flip:y;mso-wrap-style:none;v-text-anchor:middle" wp14:anchorId="7947523E" type="_x0000_t32">
+              <v:shape id="shape_0" ID="Connecteur droit avec flèche 4" stroked="t" o:allowincell="f" style="position:absolute;margin-left:292pt;margin-top:24.25pt;width:131.15pt;height:87.85pt;flip:y;mso-wrap-style:none;v-text-anchor:middle" wp14:anchorId="7947523E" type="_x0000_t32">
                 <v:fill o:detectmouseclick="t" on="false"/>
                 <v:stroke color="#ed7d31" weight="19080" endarrow="block" endarrowwidth="medium" endarrowlength="medium" joinstyle="miter" endcap="flat"/>
                 <w10:wrap type="none"/>
@@ -199,7 +199,7 @@
         <mc:AlternateContent>
           <mc:Choice Requires="wps">
             <w:drawing>
-              <wp:anchor behindDoc="0" distT="0" distB="28575" distL="0" distR="19050" simplePos="0" locked="0" layoutInCell="0" allowOverlap="1" relativeHeight="10" wp14:anchorId="3A6E5289">
+              <wp:anchor behindDoc="0" distT="6985" distB="5715" distL="6350" distR="6350" simplePos="0" locked="0" layoutInCell="0" allowOverlap="1" relativeHeight="10" wp14:anchorId="3A6E5289">
                 <wp:simplePos x="0" y="0"/>
                 <wp:positionH relativeFrom="margin">
                   <wp:align>left</wp:align>
@@ -253,7 +253,7 @@
           </mc:Choice>
           <mc:Fallback>
             <w:pict>
-              <v:rect id="shape_0" ID="Rectangle 7" path="m0,0l-2147483645,0l-2147483645,-2147483646l0,-2147483646xe" stroked="t" o:allowincell="f" style="position:absolute;margin-left:0pt;margin-top:143.5pt;width:160.45pt;height:20.2pt;mso-wrap-style:none;v-text-anchor:middle;mso-position-horizontal:left;mso-position-horizontal-relative:margin" wp14:anchorId="3A6E5289">
+              <v:rect id="shape_0" ID="Rectangle 7" path="m0,0l-2147483645,0l-2147483645,-2147483646l0,-2147483646xe" stroked="t" o:allowincell="f" style="position:absolute;margin-left:0.5pt;margin-top:143.5pt;width:160.45pt;height:20.2pt;mso-wrap-style:none;v-text-anchor:middle;mso-position-horizontal:left;mso-position-horizontal-relative:margin" wp14:anchorId="3A6E5289">
                 <v:fill o:detectmouseclick="t" on="false"/>
                 <v:stroke color="red" weight="12600" joinstyle="miter" endcap="flat"/>
                 <w10:wrap type="none"/>
@@ -287,133 +287,96 @@
           <w:szCs w:val="28"/>
           <w:lang w:val="fr-CA"/>
         </w:rPr>
-        <mc:AlternateContent>
-          <mc:Choice Requires="wps">
-            <w:drawing>
-              <wp:anchor behindDoc="0" distT="0" distB="0" distL="114300" distR="114300" simplePos="0" locked="0" layoutInCell="0" allowOverlap="1" relativeHeight="6">
-                <wp:simplePos x="0" y="0"/>
-                <wp:positionH relativeFrom="column">
-                  <wp:posOffset>1799590</wp:posOffset>
-                </wp:positionH>
-                <wp:positionV relativeFrom="paragraph">
-                  <wp:posOffset>6563360</wp:posOffset>
-                </wp:positionV>
-                <wp:extent cx="1016635" cy="243840"/>
-                <wp:effectExtent l="0" t="0" r="0" b="0"/>
-                <wp:wrapNone/>
-                <wp:docPr id="5" name="Encre 10"/>
-                <a:graphic xmlns:a="http://schemas.openxmlformats.org/drawingml/2006/main">
-                  <a:graphicData uri="http://schemas.openxmlformats.org/drawingml/2006/picture">
-                    <pic:pic xmlns:pic="http://schemas.openxmlformats.org/drawingml/2006/picture">
-                      <pic:nvPicPr>
-                        <pic:cNvPr id="0" name="Encre 10" descr=""/>
-                        <pic:cNvPicPr/>
-                      </pic:nvPicPr>
-                      <pic:blipFill>
-                        <a:blip r:embed="rId4"/>
-                        <a:stretch/>
-                      </pic:blipFill>
-                      <pic:spPr>
-                        <a:xfrm>
-                          <a:off x="0" y="0"/>
-                          <a:ext cx="1016640" cy="243720"/>
-                        </a:xfrm>
-                        <a:prstGeom prst="rect">
-                          <a:avLst/>
-                        </a:prstGeom>
-                        <a:ln w="0">
-                          <a:noFill/>
-                        </a:ln>
-                      </pic:spPr>
-                    </pic:pic>
-                  </a:graphicData>
-                </a:graphic>
-              </wp:anchor>
-            </w:drawing>
-          </mc:Choice>
-          <mc:Fallback>
-            <w:pict>
-              <v:shapetype id="_x0000_t75" coordsize="21600,21600" o:spt="75" o:preferrelative="t" path="m@4@5l@4@11@9@11@9@5xe" filled="f" stroked="f">
-                <v:stroke joinstyle="miter"/>
-                <v:formulas>
-                  <v:f eqn="if lineDrawn pixelLineWidth 0"/>
-                  <v:f eqn="sum @0 1 0"/>
-                  <v:f eqn="sum 0 0 @1"/>
-                  <v:f eqn="prod @2 1 2"/>
-                  <v:f eqn="prod @3 21600 pixelWidth"/>
-                  <v:f eqn="prod @3 21600 pixelHeight"/>
-                  <v:f eqn="sum @0 0 1"/>
-                  <v:f eqn="prod @6 1 2"/>
-                  <v:f eqn="prod @7 21600 pixelWidth"/>
-                  <v:f eqn="sum @8 21600 0"/>
-                  <v:f eqn="prod @7 21600 pixelHeight"/>
-                  <v:f eqn="sum @10 21600 0"/>
-                </v:formulas>
-                <v:path o:extrusionok="f" gradientshapeok="t" o:connecttype="rect"/>
-                <o:lock v:ext="edit" aspectratio="t"/>
-              </v:shapetype>
-              <v:shape id="shape_0" ID="Encre 10" stroked="f" o:allowincell="f" style="position:absolute;margin-left:141.7pt;margin-top:516.8pt;width:80pt;height:19.15pt;mso-wrap-style:none;v-text-anchor:middle" type="_x0000_t75">
-                <v:imagedata r:id="rId4" o:detectmouseclick="t"/>
-                <v:stroke color="#3465a4" joinstyle="round" endcap="flat"/>
-                <w10:wrap type="none"/>
-              </v:shape>
-            </w:pict>
-          </mc:Fallback>
-        </mc:AlternateContent>
-        <mc:AlternateContent>
-          <mc:Choice Requires="wps">
-            <w:drawing>
-              <wp:anchor behindDoc="0" distT="0" distB="0" distL="114300" distR="114300" simplePos="0" locked="0" layoutInCell="0" allowOverlap="1" relativeHeight="7">
-                <wp:simplePos x="0" y="0"/>
-                <wp:positionH relativeFrom="column">
-                  <wp:posOffset>1722120</wp:posOffset>
-                </wp:positionH>
-                <wp:positionV relativeFrom="paragraph">
-                  <wp:posOffset>5365750</wp:posOffset>
-                </wp:positionV>
-                <wp:extent cx="4094480" cy="1295400"/>
-                <wp:effectExtent l="0" t="0" r="0" b="0"/>
-                <wp:wrapNone/>
-                <wp:docPr id="6" name="Encre 21"/>
-                <a:graphic xmlns:a="http://schemas.openxmlformats.org/drawingml/2006/main">
-                  <a:graphicData uri="http://schemas.openxmlformats.org/drawingml/2006/picture">
-                    <pic:pic xmlns:pic="http://schemas.openxmlformats.org/drawingml/2006/picture">
-                      <pic:nvPicPr>
-                        <pic:cNvPr id="1" name="Encre 21" descr=""/>
-                        <pic:cNvPicPr/>
-                      </pic:nvPicPr>
-                      <pic:blipFill>
-                        <a:blip r:embed="rId5"/>
-                        <a:stretch/>
-                      </pic:blipFill>
-                      <pic:spPr>
-                        <a:xfrm>
-                          <a:off x="0" y="0"/>
-                          <a:ext cx="4094640" cy="1295280"/>
-                        </a:xfrm>
-                        <a:prstGeom prst="rect">
-                          <a:avLst/>
-                        </a:prstGeom>
-                        <a:ln w="0">
-                          <a:noFill/>
-                        </a:ln>
-                      </pic:spPr>
-                    </pic:pic>
-                  </a:graphicData>
-                </a:graphic>
-              </wp:anchor>
-            </w:drawing>
-          </mc:Choice>
-          <mc:Fallback>
-            <w:pict>
-              <v:shape id="shape_0" ID="Encre 21" stroked="f" o:allowincell="f" style="position:absolute;margin-left:135.6pt;margin-top:422.5pt;width:322.35pt;height:101.95pt;mso-wrap-style:none;v-text-anchor:middle" type="_x0000_t75">
-                <v:imagedata r:id="rId5" o:detectmouseclick="t"/>
-                <v:stroke color="#3465a4" joinstyle="round" endcap="flat"/>
-                <w10:wrap type="none"/>
-              </v:shape>
-            </w:pict>
-          </mc:Fallback>
-        </mc:AlternateContent>
+        <w:drawing>
+          <wp:anchor behindDoc="0" distT="0" distB="0" distL="0" distR="0" simplePos="0" locked="0" layoutInCell="0" allowOverlap="1" relativeHeight="6">
+            <wp:simplePos x="0" y="0"/>
+            <wp:positionH relativeFrom="column">
+              <wp:posOffset>1799590</wp:posOffset>
+            </wp:positionH>
+            <wp:positionV relativeFrom="paragraph">
+              <wp:posOffset>6563360</wp:posOffset>
+            </wp:positionV>
+            <wp:extent cx="1016635" cy="243840"/>
+            <wp:effectExtent l="0" t="0" r="0" b="0"/>
+            <wp:wrapNone/>
+            <wp:docPr id="5" name="Encre 10" descr=""/>
+            <wp:cNvGraphicFramePr>
+              <a:graphicFrameLocks xmlns:a="http://schemas.openxmlformats.org/drawingml/2006/main" noChangeAspect="1"/>
+            </wp:cNvGraphicFramePr>
+            <a:graphic xmlns:a="http://schemas.openxmlformats.org/drawingml/2006/main">
+              <a:graphicData uri="http://schemas.openxmlformats.org/drawingml/2006/picture">
+                <pic:pic xmlns:pic="http://schemas.openxmlformats.org/drawingml/2006/picture">
+                  <pic:nvPicPr>
+                    <pic:cNvPr id="5" name="Encre 10" descr=""/>
+                    <pic:cNvPicPr>
+                      <a:picLocks noChangeAspect="1" noChangeArrowheads="1"/>
+                    </pic:cNvPicPr>
+                  </pic:nvPicPr>
+                  <pic:blipFill>
+                    <a:blip r:embed="rId4"/>
+                    <a:stretch>
+                      <a:fillRect/>
+                    </a:stretch>
+                  </pic:blipFill>
+                  <pic:spPr bwMode="auto">
+                    <a:xfrm>
+                      <a:off x="0" y="0"/>
+                      <a:ext cx="1016635" cy="243840"/>
+                    </a:xfrm>
+                    <a:prstGeom prst="rect">
+                      <a:avLst/>
+                    </a:prstGeom>
+                  </pic:spPr>
+                </pic:pic>
+              </a:graphicData>
+            </a:graphic>
+          </wp:anchor>
+        </w:drawing>
+        <w:drawing>
+          <wp:anchor behindDoc="0" distT="0" distB="0" distL="0" distR="0" simplePos="0" locked="0" layoutInCell="0" allowOverlap="1" relativeHeight="7">
+            <wp:simplePos x="0" y="0"/>
+            <wp:positionH relativeFrom="column">
+              <wp:posOffset>1722120</wp:posOffset>
+            </wp:positionH>
+            <wp:positionV relativeFrom="paragraph">
+              <wp:posOffset>5365750</wp:posOffset>
+            </wp:positionV>
+            <wp:extent cx="4094480" cy="1295400"/>
+            <wp:effectExtent l="0" t="0" r="0" b="0"/>
+            <wp:wrapNone/>
+            <wp:docPr id="6" name="Encre 21" descr=""/>
+            <wp:cNvGraphicFramePr>
+              <a:graphicFrameLocks xmlns:a="http://schemas.openxmlformats.org/drawingml/2006/main" noChangeAspect="1"/>
+            </wp:cNvGraphicFramePr>
+            <a:graphic xmlns:a="http://schemas.openxmlformats.org/drawingml/2006/main">
+              <a:graphicData uri="http://schemas.openxmlformats.org/drawingml/2006/picture">
+                <pic:pic xmlns:pic="http://schemas.openxmlformats.org/drawingml/2006/picture">
+                  <pic:nvPicPr>
+                    <pic:cNvPr id="6" name="Encre 21" descr=""/>
+                    <pic:cNvPicPr>
+                      <a:picLocks noChangeAspect="1" noChangeArrowheads="1"/>
+                    </pic:cNvPicPr>
+                  </pic:nvPicPr>
+                  <pic:blipFill>
+                    <a:blip r:embed="rId5"/>
+                    <a:stretch>
+                      <a:fillRect/>
+                    </a:stretch>
+                  </pic:blipFill>
+                  <pic:spPr bwMode="auto">
+                    <a:xfrm>
+                      <a:off x="0" y="0"/>
+                      <a:ext cx="4094480" cy="1295400"/>
+                    </a:xfrm>
+                    <a:prstGeom prst="rect">
+                      <a:avLst/>
+                    </a:prstGeom>
+                  </pic:spPr>
+                </pic:pic>
+              </a:graphicData>
+            </a:graphic>
+          </wp:anchor>
+        </w:drawing>
         <w:drawing>
           <wp:anchor behindDoc="0" distT="0" distB="0" distL="114300" distR="114300" simplePos="0" locked="0" layoutInCell="0" allowOverlap="1" relativeHeight="9">
             <wp:simplePos x="0" y="0"/>
@@ -475,7 +438,7 @@
         <mc:AlternateContent>
           <mc:Choice Requires="wps">
             <w:drawing>
-              <wp:anchor behindDoc="0" distT="0" distB="28575" distL="0" distR="28575" simplePos="0" locked="0" layoutInCell="0" allowOverlap="1" relativeHeight="11" wp14:anchorId="4C7B4E6A">
+              <wp:anchor behindDoc="0" distT="6985" distB="5715" distL="6985" distR="5715" simplePos="0" locked="0" layoutInCell="0" allowOverlap="1" relativeHeight="11" wp14:anchorId="4C7B4E6A">
                 <wp:simplePos x="0" y="0"/>
                 <wp:positionH relativeFrom="column">
                   <wp:posOffset>2552700</wp:posOffset>
@@ -1377,7 +1340,7 @@
         <mc:AlternateContent>
           <mc:Choice Requires="wps">
             <w:drawing>
-              <wp:anchor behindDoc="0" distT="0" distB="28575" distL="0" distR="19050" simplePos="0" locked="0" layoutInCell="0" allowOverlap="1" relativeHeight="12" wp14:anchorId="1519A5A4">
+              <wp:anchor behindDoc="0" distT="6985" distB="5715" distL="6350" distR="6350" simplePos="0" locked="0" layoutInCell="0" allowOverlap="1" relativeHeight="12" wp14:anchorId="1519A5A4">
                 <wp:simplePos x="0" y="0"/>
                 <wp:positionH relativeFrom="column">
                   <wp:posOffset>0</wp:posOffset>
@@ -1498,7 +1461,7 @@
         <mc:AlternateContent>
           <mc:Choice Requires="wps">
             <w:drawing>
-              <wp:anchor behindDoc="0" distT="0" distB="19050" distL="0" distR="19050" simplePos="0" locked="0" layoutInCell="0" allowOverlap="1" relativeHeight="13" wp14:anchorId="47CA7947">
+              <wp:anchor behindDoc="0" distT="6350" distB="6350" distL="6350" distR="6350" simplePos="0" locked="0" layoutInCell="0" allowOverlap="1" relativeHeight="13" wp14:anchorId="47CA7947">
                 <wp:simplePos x="0" y="0"/>
                 <wp:positionH relativeFrom="column">
                   <wp:posOffset>76200</wp:posOffset>
@@ -1664,7 +1627,7 @@
         <mc:AlternateContent>
           <mc:Choice Requires="wps">
             <w:drawing>
-              <wp:anchor behindDoc="0" distT="0" distB="28575" distL="0" distR="19050" simplePos="0" locked="0" layoutInCell="0" allowOverlap="1" relativeHeight="15" wp14:anchorId="37D0A3DC">
+              <wp:anchor behindDoc="0" distT="6985" distB="5715" distL="6350" distR="6350" simplePos="0" locked="0" layoutInCell="0" allowOverlap="1" relativeHeight="15" wp14:anchorId="37D0A3DC">
                 <wp:simplePos x="0" y="0"/>
                 <wp:positionH relativeFrom="column">
                   <wp:posOffset>2352675</wp:posOffset>
@@ -1823,7 +1786,7 @@
         <mc:AlternateContent>
           <mc:Choice Requires="wps">
             <w:drawing>
-              <wp:anchor behindDoc="0" distT="0" distB="28575" distL="0" distR="19050" simplePos="0" locked="0" layoutInCell="0" allowOverlap="1" relativeHeight="17" wp14:anchorId="4FF7B951">
+              <wp:anchor behindDoc="0" distT="6985" distB="5715" distL="6350" distR="6350" simplePos="0" locked="0" layoutInCell="0" allowOverlap="1" relativeHeight="17" wp14:anchorId="4FF7B951">
                 <wp:simplePos x="0" y="0"/>
                 <wp:positionH relativeFrom="margin">
                   <wp:align>left</wp:align>
@@ -1877,7 +1840,7 @@
           </mc:Choice>
           <mc:Fallback>
             <w:pict>
-              <v:rect id="shape_0" ID="Rectangle 32" path="m0,0l-2147483645,0l-2147483645,-2147483646l0,-2147483646xe" stroked="t" o:allowincell="f" style="position:absolute;margin-left:0pt;margin-top:87.75pt;width:263.95pt;height:24.7pt;mso-wrap-style:none;v-text-anchor:middle;mso-position-horizontal:left;mso-position-horizontal-relative:margin" wp14:anchorId="4FF7B951">
+              <v:rect id="shape_0" ID="Rectangle 32" path="m0,0l-2147483645,0l-2147483645,-2147483646l0,-2147483646xe" stroked="t" o:allowincell="f" style="position:absolute;margin-left:0.5pt;margin-top:87.75pt;width:263.95pt;height:24.7pt;mso-wrap-style:none;v-text-anchor:middle;mso-position-horizontal:left;mso-position-horizontal-relative:margin" wp14:anchorId="4FF7B951">
                 <v:fill o:detectmouseclick="t" on="false"/>
                 <v:stroke color="red" weight="12600" joinstyle="miter" endcap="flat"/>
                 <w10:wrap type="none"/>
@@ -2013,11 +1976,11 @@
             <wp:effectExtent l="0" t="0" r="0" b="0"/>
             <wp:wrapTight wrapText="bothSides">
               <wp:wrapPolygon edited="0">
-                <wp:start x="-3" y="0"/>
-                <wp:lineTo x="-3" y="21515"/>
-                <wp:lineTo x="21489" y="21515"/>
-                <wp:lineTo x="21489" y="0"/>
-                <wp:lineTo x="-3" y="0"/>
+                <wp:start x="-7" y="0"/>
+                <wp:lineTo x="-7" y="21512"/>
+                <wp:lineTo x="21485" y="21512"/>
+                <wp:lineTo x="21485" y="0"/>
+                <wp:lineTo x="-7" y="0"/>
               </wp:wrapPolygon>
             </wp:wrapTight>
             <wp:docPr id="18" name="Image 34" descr=""/>
@@ -2056,7 +2019,7 @@
         <mc:AlternateContent>
           <mc:Choice Requires="wps">
             <w:drawing>
-              <wp:anchor behindDoc="0" distT="0" distB="19050" distL="0" distR="19050" simplePos="0" locked="0" layoutInCell="0" allowOverlap="1" relativeHeight="20" wp14:anchorId="4FBBA817">
+              <wp:anchor behindDoc="0" distT="6350" distB="6350" distL="6350" distR="6350" simplePos="0" locked="0" layoutInCell="0" allowOverlap="1" relativeHeight="20" wp14:anchorId="4FBBA817">
                 <wp:simplePos x="0" y="0"/>
                 <wp:positionH relativeFrom="column">
                   <wp:posOffset>3705225</wp:posOffset>
@@ -2121,7 +2084,7 @@
         <mc:AlternateContent>
           <mc:Choice Requires="wps">
             <w:drawing>
-              <wp:anchor behindDoc="0" distT="0" distB="19050" distL="0" distR="28575" simplePos="0" locked="0" layoutInCell="0" allowOverlap="1" relativeHeight="21" wp14:anchorId="1790E7BB">
+              <wp:anchor behindDoc="0" distT="6350" distB="6350" distL="6985" distR="5715" simplePos="0" locked="0" layoutInCell="0" allowOverlap="1" relativeHeight="21" wp14:anchorId="1790E7BB">
                 <wp:simplePos x="0" y="0"/>
                 <wp:positionH relativeFrom="column">
                   <wp:posOffset>2638425</wp:posOffset>
@@ -2268,7 +2231,7 @@
         <mc:AlternateContent>
           <mc:Choice Requires="wps">
             <w:drawing>
-              <wp:anchor behindDoc="0" distT="0" distB="0" distL="0" distR="0" simplePos="0" locked="0" layoutInCell="0" allowOverlap="1" relativeHeight="24">
+              <wp:anchor behindDoc="0" distT="1270" distB="635" distL="1270" distR="635" simplePos="0" locked="0" layoutInCell="0" allowOverlap="1" relativeHeight="23">
                 <wp:simplePos x="0" y="0"/>
                 <wp:positionH relativeFrom="column">
                   <wp:posOffset>1552575</wp:posOffset>
@@ -2338,8 +2301,8 @@
                   <v:h position="@3,0"/>
                 </v:handles>
               </v:shapetype>
-              <v:shape id="shape_0" ID="Shape 1" fillcolor="#729fcf" stroked="t" o:allowincell="f" style="position:absolute;margin-left:122.25pt;margin-top:53.1pt;width:71.2pt;height:20.2pt;mso-wrap-style:none;v-text-anchor:middle" type="_x0000_t66">
-                <v:fill o:detectmouseclick="t" color2="#8d6030"/>
+              <v:shape id="shape_0" ID="Shape 1" path="l-2147483635,0l-2147483635,-2147483631l-2147483624,-2147483631l-2147483624,-2147483629l-2147483635,-2147483629l-2147483635,-2147483623xe" fillcolor="#729fcf" stroked="t" o:allowincell="f" style="position:absolute;margin-left:122.25pt;margin-top:53.1pt;width:71.2pt;height:20.2pt;mso-wrap-style:none;v-text-anchor:middle" type="_x0000_t66">
+                <v:fill o:detectmouseclick="t" type="solid" color2="#8d6030"/>
                 <v:stroke color="#3465a4" joinstyle="round" endcap="flat"/>
                 <w10:wrap type="none"/>
               </v:shape>
@@ -2434,9 +2397,8 @@
         <w:rPr/>
       </w:pPr>
       <w:r>
-        <w:rPr/>
         <w:drawing>
-          <wp:anchor behindDoc="0" distT="0" distB="0" distL="0" distR="0" simplePos="0" locked="0" layoutInCell="0" allowOverlap="1" relativeHeight="25">
+          <wp:anchor behindDoc="0" distT="0" distB="0" distL="0" distR="0" simplePos="0" locked="0" layoutInCell="0" allowOverlap="1" relativeHeight="24">
             <wp:simplePos x="0" y="0"/>
             <wp:positionH relativeFrom="column">
               <wp:posOffset>4486275</wp:posOffset>
@@ -2506,7 +2468,7 @@
         <mc:AlternateContent>
           <mc:Choice Requires="wps">
             <w:drawing>
-              <wp:anchor behindDoc="0" distT="0" distB="0" distL="0" distR="0" simplePos="0" locked="0" layoutInCell="0" allowOverlap="1" relativeHeight="27">
+              <wp:anchor behindDoc="0" distT="1270" distB="635" distL="1270" distR="635" simplePos="0" locked="0" layoutInCell="0" allowOverlap="1" relativeHeight="26">
                 <wp:simplePos x="0" y="0"/>
                 <wp:positionH relativeFrom="column">
                   <wp:posOffset>4162425</wp:posOffset>
@@ -2557,8 +2519,8 @@
           </mc:Choice>
           <mc:Fallback>
             <w:pict>
-              <v:shape id="shape_0" ID="Shape 2" fillcolor="#729fcf" stroked="t" o:allowincell="f" style="position:absolute;margin-left:327.75pt;margin-top:56.1pt;width:52.4pt;height:20.2pt;flip:x;mso-wrap-style:none;v-text-anchor:middle" type="_x0000_t66">
-                <v:fill o:detectmouseclick="t" color2="#8d6030"/>
+              <v:shape id="shape_0" ID="Shape 2" path="l-2147483635,0l-2147483635,-2147483631l-2147483624,-2147483631l-2147483624,-2147483629l-2147483635,-2147483629l-2147483635,-2147483623xe" fillcolor="#729fcf" stroked="t" o:allowincell="f" style="position:absolute;margin-left:327.75pt;margin-top:56.1pt;width:52.4pt;height:20.2pt;flip:x;mso-wrap-style:none;v-text-anchor:middle" type="_x0000_t66">
+                <v:fill o:detectmouseclick="t" type="solid" color2="#8d6030"/>
                 <v:stroke color="#3465a4" joinstyle="round" endcap="flat"/>
                 <w10:wrap type="none"/>
               </v:shape>
@@ -2568,7 +2530,7 @@
         <mc:AlternateContent>
           <mc:Choice Requires="wps">
             <w:drawing>
-              <wp:anchor behindDoc="0" distT="0" distB="0" distL="0" distR="0" simplePos="0" locked="0" layoutInCell="0" allowOverlap="1" relativeHeight="28">
+              <wp:anchor behindDoc="0" distT="1270" distB="635" distL="1270" distR="635" simplePos="0" locked="0" layoutInCell="0" allowOverlap="1" relativeHeight="27">
                 <wp:simplePos x="0" y="0"/>
                 <wp:positionH relativeFrom="column">
                   <wp:posOffset>3371850</wp:posOffset>
@@ -2619,8 +2581,8 @@
           </mc:Choice>
           <mc:Fallback>
             <w:pict>
-              <v:shape id="shape_0" ID="Shape 3" fillcolor="#729fcf" stroked="t" o:allowincell="f" style="position:absolute;margin-left:265.5pt;margin-top:256.35pt;width:71.2pt;height:20.2pt;mso-wrap-style:none;v-text-anchor:middle" type="_x0000_t66">
-                <v:fill o:detectmouseclick="t" color2="#8d6030"/>
+              <v:shape id="shape_0" ID="Shape 3" path="l-2147483635,0l-2147483635,-2147483631l-2147483624,-2147483631l-2147483624,-2147483629l-2147483635,-2147483629l-2147483635,-2147483623xe" fillcolor="#729fcf" stroked="t" o:allowincell="f" style="position:absolute;margin-left:265.5pt;margin-top:256.35pt;width:71.2pt;height:20.2pt;mso-wrap-style:none;v-text-anchor:middle" type="_x0000_t66">
+                <v:fill o:detectmouseclick="t" type="solid" color2="#8d6030"/>
                 <v:stroke color="#3465a4" joinstyle="round" endcap="flat"/>
                 <w10:wrap type="none"/>
               </v:shape>
@@ -2630,9 +2592,8 @@
         <w:t xml:space="preserve"> </w:t>
       </w:r>
       <w:r>
-        <w:rPr/>
         <w:drawing>
-          <wp:anchor behindDoc="0" distT="0" distB="0" distL="0" distR="0" simplePos="0" locked="0" layoutInCell="0" allowOverlap="1" relativeHeight="26">
+          <wp:anchor behindDoc="0" distT="0" distB="0" distL="0" distR="0" simplePos="0" locked="0" layoutInCell="0" allowOverlap="1" relativeHeight="25">
             <wp:simplePos x="0" y="0"/>
             <wp:positionH relativeFrom="column">
               <wp:posOffset>-168910</wp:posOffset>
@@ -2685,9 +2646,7 @@
     <w:p>
       <w:pPr>
         <w:pStyle w:val="Heading1"/>
-        <w:rPr>
-          <w:lang w:val="fr-CA"/>
-        </w:rPr>
+        <w:rPr/>
       </w:pPr>
       <w:r>
         <w:br w:type="column"/>
@@ -2697,13 +2656,13 @@
         <mc:AlternateContent>
           <mc:Choice Requires="wps">
             <w:drawing>
-              <wp:anchor behindDoc="0" distT="0" distB="0" distL="0" distR="0" simplePos="0" locked="0" layoutInCell="0" allowOverlap="1" relativeHeight="30">
+              <wp:anchor behindDoc="0" distT="1270" distB="635" distL="1270" distR="635" simplePos="0" locked="0" layoutInCell="0" allowOverlap="1" relativeHeight="29">
                 <wp:simplePos x="0" y="0"/>
                 <wp:positionH relativeFrom="column">
-                  <wp:posOffset>2362200</wp:posOffset>
+                  <wp:posOffset>2895600</wp:posOffset>
                 </wp:positionH>
                 <wp:positionV relativeFrom="paragraph">
-                  <wp:posOffset>236220</wp:posOffset>
+                  <wp:posOffset>-113665</wp:posOffset>
                 </wp:positionV>
                 <wp:extent cx="666115" cy="257175"/>
                 <wp:effectExtent l="1270" t="1270" r="635" b="635"/>
@@ -2748,24 +2707,32 @@
           </mc:Choice>
           <mc:Fallback>
             <w:pict>
-              <v:shape id="shape_0" ID="Shape 4" fillcolor="#729fcf" stroked="t" o:allowincell="f" style="position:absolute;margin-left:186pt;margin-top:18.6pt;width:52.4pt;height:20.2pt;flip:x;mso-wrap-style:none;v-text-anchor:middle" type="_x0000_t66">
-                <v:fill o:detectmouseclick="t" color2="#8d6030"/>
+              <v:shape id="shape_0" ID="Shape 4" path="l-2147483635,0l-2147483635,-2147483631l-2147483624,-2147483631l-2147483624,-2147483629l-2147483635,-2147483629l-2147483635,-2147483623xe" fillcolor="#729fcf" stroked="t" o:allowincell="f" style="position:absolute;margin-left:228pt;margin-top:-8.95pt;width:52.4pt;height:20.2pt;flip:x;mso-wrap-style:none;v-text-anchor:middle" type="_x0000_t66">
+                <v:fill o:detectmouseclick="t" type="solid" color2="#8d6030"/>
                 <v:stroke color="#3465a4" joinstyle="round" endcap="flat"/>
                 <w10:wrap type="none"/>
               </v:shape>
             </w:pict>
           </mc:Fallback>
         </mc:AlternateContent>
+        <w:t>Création d’</w:t>
+      </w:r>
+      <w:r>
+        <w:rPr/>
+        <w:t>un</w:t>
+      </w:r>
+      <w:r>
+        <w:rPr/>
         <w:drawing>
-          <wp:anchor behindDoc="0" distT="0" distB="0" distL="0" distR="0" simplePos="0" locked="0" layoutInCell="0" allowOverlap="1" relativeHeight="29">
+          <wp:anchor behindDoc="0" distT="0" distB="0" distL="0" distR="0" simplePos="0" locked="0" layoutInCell="0" allowOverlap="1" relativeHeight="28">
             <wp:simplePos x="0" y="0"/>
             <wp:positionH relativeFrom="column">
-              <wp:posOffset>2838450</wp:posOffset>
+              <wp:posOffset>3415665</wp:posOffset>
             </wp:positionH>
             <wp:positionV relativeFrom="paragraph">
-              <wp:posOffset>116840</wp:posOffset>
+              <wp:posOffset>-189865</wp:posOffset>
             </wp:positionV>
-            <wp:extent cx="3581400" cy="5676900"/>
+            <wp:extent cx="2947035" cy="4671060"/>
             <wp:effectExtent l="0" t="0" r="0" b="0"/>
             <wp:wrapSquare wrapText="largest"/>
             <wp:docPr id="28" name="Image6" descr=""/>
@@ -2790,7 +2757,7 @@
                   <pic:spPr bwMode="auto">
                     <a:xfrm>
                       <a:off x="0" y="0"/>
-                      <a:ext cx="3581400" cy="5676900"/>
+                      <a:ext cx="2947035" cy="4671060"/>
                     </a:xfrm>
                     <a:prstGeom prst="rect">
                       <a:avLst/>
@@ -2804,7 +2771,7 @@
       </w:r>
       <w:r>
         <w:rPr/>
-        <w:t>Création de groupe</w:t>
+        <w:t xml:space="preserve"> groupe</w:t>
       </w:r>
     </w:p>
     <w:p>
@@ -2831,13 +2798,13 @@
         <mc:AlternateContent>
           <mc:Choice Requires="wps">
             <w:drawing>
-              <wp:anchor behindDoc="0" distT="0" distB="0" distL="0" distR="0" simplePos="0" locked="0" layoutInCell="0" allowOverlap="1" relativeHeight="31">
+              <wp:anchor behindDoc="0" distT="1270" distB="635" distL="1270" distR="635" simplePos="0" locked="0" layoutInCell="0" allowOverlap="1" relativeHeight="30">
                 <wp:simplePos x="0" y="0"/>
                 <wp:positionH relativeFrom="column">
-                  <wp:posOffset>2552700</wp:posOffset>
+                  <wp:posOffset>3028950</wp:posOffset>
                 </wp:positionH>
                 <wp:positionV relativeFrom="paragraph">
-                  <wp:posOffset>2179320</wp:posOffset>
+                  <wp:posOffset>1388745</wp:posOffset>
                 </wp:positionV>
                 <wp:extent cx="666115" cy="257175"/>
                 <wp:effectExtent l="1270" t="1270" r="635" b="635"/>
@@ -2882,7 +2849,160 @@
           </mc:Choice>
           <mc:Fallback>
             <w:pict>
-              <v:shape id="shape_0" ID="Shape 5" fillcolor="#729fcf" stroked="t" o:allowincell="f" style="position:absolute;margin-left:201pt;margin-top:171.6pt;width:52.4pt;height:20.2pt;flip:x;mso-wrap-style:none;v-text-anchor:middle" type="_x0000_t66">
+              <v:shape id="shape_0" ID="Shape 5" path="l-2147483635,0l-2147483635,-2147483631l-2147483624,-2147483631l-2147483624,-2147483629l-2147483635,-2147483629l-2147483635,-2147483623xe" fillcolor="#729fcf" stroked="t" o:allowincell="f" style="position:absolute;margin-left:238.5pt;margin-top:109.35pt;width:52.4pt;height:20.2pt;flip:x;mso-wrap-style:none;v-text-anchor:middle" type="_x0000_t66">
+                <v:fill o:detectmouseclick="t" type="solid" color2="#8d6030"/>
+                <v:stroke color="#3465a4" joinstyle="round" endcap="flat"/>
+                <w10:wrap type="none"/>
+              </v:shape>
+            </w:pict>
+          </mc:Fallback>
+        </mc:AlternateContent>
+      </w:r>
+      <w:r>
+        <w:rPr/>
+        <w:t>Pour créer un canal cliquer en haut à gauche et appuyer sur Créer un canal</w:t>
+      </w:r>
+    </w:p>
+    <w:p>
+      <w:pPr>
+        <w:pStyle w:val="Normal"/>
+        <w:spacing w:before="0" w:after="160"/>
+        <w:rPr>
+          <w:lang w:val="fr-CA"/>
+        </w:rPr>
+      </w:pPr>
+      <w:r>
+        <w:rPr/>
+      </w:r>
+    </w:p>
+    <w:p>
+      <w:pPr>
+        <w:pStyle w:val="Normal"/>
+        <w:spacing w:before="0" w:after="160"/>
+        <w:rPr>
+          <w:lang w:val="fr-CA"/>
+        </w:rPr>
+      </w:pPr>
+      <w:r>
+        <w:drawing>
+          <wp:anchor behindDoc="0" distT="0" distB="0" distL="0" distR="0" simplePos="0" locked="0" layoutInCell="0" allowOverlap="1" relativeHeight="32">
+            <wp:simplePos x="0" y="0"/>
+            <wp:positionH relativeFrom="column">
+              <wp:posOffset>-314960</wp:posOffset>
+            </wp:positionH>
+            <wp:positionV relativeFrom="paragraph">
+              <wp:posOffset>960120</wp:posOffset>
+            </wp:positionV>
+            <wp:extent cx="3676650" cy="3697605"/>
+            <wp:effectExtent l="0" t="0" r="0" b="0"/>
+            <wp:wrapSquare wrapText="largest"/>
+            <wp:docPr id="30" name="Image7" descr=""/>
+            <wp:cNvGraphicFramePr>
+              <a:graphicFrameLocks xmlns:a="http://schemas.openxmlformats.org/drawingml/2006/main" noChangeAspect="1"/>
+            </wp:cNvGraphicFramePr>
+            <a:graphic xmlns:a="http://schemas.openxmlformats.org/drawingml/2006/main">
+              <a:graphicData uri="http://schemas.openxmlformats.org/drawingml/2006/picture">
+                <pic:pic xmlns:pic="http://schemas.openxmlformats.org/drawingml/2006/picture">
+                  <pic:nvPicPr>
+                    <pic:cNvPr id="30" name="Image7" descr=""/>
+                    <pic:cNvPicPr>
+                      <a:picLocks noChangeAspect="1" noChangeArrowheads="1"/>
+                    </pic:cNvPicPr>
+                  </pic:nvPicPr>
+                  <pic:blipFill>
+                    <a:blip r:embed="rId17"/>
+                    <a:stretch>
+                      <a:fillRect/>
+                    </a:stretch>
+                  </pic:blipFill>
+                  <pic:spPr bwMode="auto">
+                    <a:xfrm>
+                      <a:off x="0" y="0"/>
+                      <a:ext cx="3676650" cy="3697605"/>
+                    </a:xfrm>
+                    <a:prstGeom prst="rect">
+                      <a:avLst/>
+                    </a:prstGeom>
+                  </pic:spPr>
+                </pic:pic>
+              </a:graphicData>
+            </a:graphic>
+          </wp:anchor>
+        </w:drawing>
+        <mc:AlternateContent>
+          <mc:Choice Requires="wps">
+            <w:drawing>
+              <wp:anchor behindDoc="0" distT="0" distB="0" distL="0" distR="0" simplePos="0" locked="0" layoutInCell="0" allowOverlap="1" relativeHeight="33">
+                <wp:simplePos x="0" y="0"/>
+                <wp:positionH relativeFrom="column">
+                  <wp:posOffset>1209675</wp:posOffset>
+                </wp:positionH>
+                <wp:positionV relativeFrom="paragraph">
+                  <wp:posOffset>720090</wp:posOffset>
+                </wp:positionV>
+                <wp:extent cx="200025" cy="1438275"/>
+                <wp:effectExtent l="1270" t="1270" r="635" b="635"/>
+                <wp:wrapNone/>
+                <wp:docPr id="31" name="Shape 6"/>
+                <a:graphic xmlns:a="http://schemas.openxmlformats.org/drawingml/2006/main">
+                  <a:graphicData uri="http://schemas.microsoft.com/office/word/2010/wordprocessingShape">
+                    <wps:wsp>
+                      <wps:cNvSpPr/>
+                      <wps:spPr>
+                        <a:xfrm>
+                          <a:off x="0" y="0"/>
+                          <a:ext cx="200160" cy="1438200"/>
+                        </a:xfrm>
+                        <a:prstGeom prst="downArrow">
+                          <a:avLst>
+                            <a:gd name="adj1" fmla="val 50000"/>
+                            <a:gd name="adj2" fmla="val 179631"/>
+                          </a:avLst>
+                        </a:prstGeom>
+                        <a:solidFill>
+                          <a:srgbClr val="729fcf"/>
+                        </a:solidFill>
+                        <a:ln w="0">
+                          <a:solidFill>
+                            <a:srgbClr val="3465a4"/>
+                          </a:solidFill>
+                        </a:ln>
+                      </wps:spPr>
+                      <wps:style>
+                        <a:lnRef idx="0"/>
+                        <a:fillRef idx="0"/>
+                        <a:effectRef idx="0"/>
+                        <a:fontRef idx="minor"/>
+                      </wps:style>
+                      <wps:bodyPr/>
+                    </wps:wsp>
+                  </a:graphicData>
+                </a:graphic>
+              </wp:anchor>
+            </w:drawing>
+          </mc:Choice>
+          <mc:Fallback>
+            <w:pict>
+              <v:shapetype id="_x0000_t67" coordsize="21600,21600" o:spt="67" adj="10800,10800" path="m0@3l@5@3l@5,l@6,l@6@3l21600@3l10800,21600xe">
+                <v:stroke joinstyle="miter"/>
+                <v:formulas>
+                  <v:f eqn="val 21600"/>
+                  <v:f eqn="val #1"/>
+                  <v:f eqn="val #0"/>
+                  <v:f eqn="sum height 0 @2"/>
+                  <v:f eqn="prod 1 @1 2"/>
+                  <v:f eqn="sum 10800 0 @4"/>
+                  <v:f eqn="sum 10800 @4 0"/>
+                  <v:f eqn="prod @5 @2 10800"/>
+                  <v:f eqn="sum @3 @7 0"/>
+                </v:formulas>
+                <v:path gradientshapeok="t" o:connecttype="rect" textboxrect="@5,0,@6,@8"/>
+                <v:handles>
+                  <v:h position="@5,0"/>
+                  <v:h position="0,@3"/>
+                </v:handles>
+              </v:shapetype>
+              <v:shape id="shape_0" ID="Shape 6" fillcolor="#729fcf" stroked="t" o:allowincell="f" style="position:absolute;margin-left:95.25pt;margin-top:56.7pt;width:15.7pt;height:113.2pt;mso-wrap-style:none;v-text-anchor:middle" type="_x0000_t67">
                 <v:fill o:detectmouseclick="t" color2="#8d6030"/>
                 <v:stroke color="#3465a4" joinstyle="round" endcap="flat"/>
                 <w10:wrap type="none"/>
@@ -2893,7 +3013,402 @@
       </w:r>
       <w:r>
         <w:rPr/>
-        <w:t>Pour créer un canal cliquer en haut à gauche et appuyer sur Créer un canal</w:t>
+        <w:t>Entrez ensuite les informations concernant le canal que vous voulez créer comme le nom, la description et si le canal est privé ou public</w:t>
+      </w:r>
+    </w:p>
+    <w:p>
+      <w:pPr>
+        <w:pStyle w:val="Normal"/>
+        <w:spacing w:before="0" w:after="160"/>
+        <w:rPr>
+          <w:lang w:val="fr-CA"/>
+        </w:rPr>
+      </w:pPr>
+      <w:r>
+        <w:rPr/>
+      </w:r>
+    </w:p>
+    <w:p>
+      <w:pPr>
+        <w:pStyle w:val="Normal"/>
+        <w:spacing w:before="0" w:after="160"/>
+        <w:rPr>
+          <w:lang w:val="fr-CA"/>
+        </w:rPr>
+      </w:pPr>
+      <w:r>
+        <w:rPr/>
+      </w:r>
+    </w:p>
+    <w:p>
+      <w:pPr>
+        <w:pStyle w:val="Normal"/>
+        <w:spacing w:before="0" w:after="160"/>
+        <w:rPr>
+          <w:lang w:val="fr-CA"/>
+        </w:rPr>
+      </w:pPr>
+      <w:r>
+        <w:rPr/>
+      </w:r>
+    </w:p>
+    <w:p>
+      <w:pPr>
+        <w:pStyle w:val="Normal"/>
+        <w:spacing w:before="0" w:after="160"/>
+        <w:rPr>
+          <w:lang w:val="fr-CA"/>
+        </w:rPr>
+      </w:pPr>
+      <w:r>
+        <w:rPr/>
+      </w:r>
+    </w:p>
+    <w:p>
+      <w:pPr>
+        <w:pStyle w:val="Normal"/>
+        <w:spacing w:before="0" w:after="160"/>
+        <w:rPr>
+          <w:lang w:val="fr-CA"/>
+        </w:rPr>
+      </w:pPr>
+      <w:r>
+        <w:rPr/>
+      </w:r>
+    </w:p>
+    <w:p>
+      <w:pPr>
+        <w:pStyle w:val="Normal"/>
+        <w:spacing w:before="0" w:after="160"/>
+        <w:rPr>
+          <w:lang w:val="fr-CA"/>
+        </w:rPr>
+      </w:pPr>
+      <w:r>
+        <w:rPr/>
+      </w:r>
+    </w:p>
+    <w:p>
+      <w:pPr>
+        <w:pStyle w:val="Normal"/>
+        <w:spacing w:before="0" w:after="160"/>
+        <w:rPr>
+          <w:lang w:val="fr-CA"/>
+        </w:rPr>
+      </w:pPr>
+      <w:r>
+        <w:rPr/>
+      </w:r>
+    </w:p>
+    <w:p>
+      <w:pPr>
+        <w:pStyle w:val="Normal"/>
+        <w:spacing w:before="0" w:after="160"/>
+        <w:rPr>
+          <w:lang w:val="fr-CA"/>
+        </w:rPr>
+      </w:pPr>
+      <w:r>
+        <w:rPr/>
+      </w:r>
+    </w:p>
+    <w:p>
+      <w:pPr>
+        <w:pStyle w:val="Normal"/>
+        <w:spacing w:before="0" w:after="160"/>
+        <w:rPr>
+          <w:lang w:val="fr-CA"/>
+        </w:rPr>
+      </w:pPr>
+      <w:r>
+        <w:rPr/>
+      </w:r>
+    </w:p>
+    <w:p>
+      <w:pPr>
+        <w:pStyle w:val="Normal"/>
+        <w:spacing w:before="0" w:after="160"/>
+        <w:rPr>
+          <w:lang w:val="fr-CA"/>
+        </w:rPr>
+      </w:pPr>
+      <w:r>
+        <w:rPr/>
+      </w:r>
+    </w:p>
+    <w:p>
+      <w:pPr>
+        <w:pStyle w:val="Normal"/>
+        <w:spacing w:before="0" w:after="160"/>
+        <w:rPr>
+          <w:lang w:val="fr-CA"/>
+        </w:rPr>
+      </w:pPr>
+      <w:r>
+        <w:rPr/>
+      </w:r>
+    </w:p>
+    <w:p>
+      <w:pPr>
+        <w:pStyle w:val="Normal"/>
+        <w:spacing w:before="0" w:after="160"/>
+        <w:rPr>
+          <w:lang w:val="fr-CA"/>
+        </w:rPr>
+      </w:pPr>
+      <w:r>
+        <w:rPr/>
+      </w:r>
+    </w:p>
+    <w:p>
+      <w:pPr>
+        <w:pStyle w:val="Normal"/>
+        <w:spacing w:before="0" w:after="160"/>
+        <w:rPr>
+          <w:lang w:val="fr-CA"/>
+        </w:rPr>
+      </w:pPr>
+      <w:r>
+        <w:rPr/>
+        <w:drawing>
+          <wp:anchor behindDoc="0" distT="0" distB="0" distL="0" distR="0" simplePos="0" locked="0" layoutInCell="0" allowOverlap="1" relativeHeight="34">
+            <wp:simplePos x="0" y="0"/>
+            <wp:positionH relativeFrom="column">
+              <wp:posOffset>4311015</wp:posOffset>
+            </wp:positionH>
+            <wp:positionV relativeFrom="paragraph">
+              <wp:posOffset>42545</wp:posOffset>
+            </wp:positionV>
+            <wp:extent cx="2355850" cy="3734435"/>
+            <wp:effectExtent l="0" t="0" r="0" b="0"/>
+            <wp:wrapSquare wrapText="largest"/>
+            <wp:docPr id="32" name="Image9" descr=""/>
+            <wp:cNvGraphicFramePr>
+              <a:graphicFrameLocks xmlns:a="http://schemas.openxmlformats.org/drawingml/2006/main" noChangeAspect="1"/>
+            </wp:cNvGraphicFramePr>
+            <a:graphic xmlns:a="http://schemas.openxmlformats.org/drawingml/2006/main">
+              <a:graphicData uri="http://schemas.openxmlformats.org/drawingml/2006/picture">
+                <pic:pic xmlns:pic="http://schemas.openxmlformats.org/drawingml/2006/picture">
+                  <pic:nvPicPr>
+                    <pic:cNvPr id="32" name="Image9" descr=""/>
+                    <pic:cNvPicPr>
+                      <a:picLocks noChangeAspect="1" noChangeArrowheads="1"/>
+                    </pic:cNvPicPr>
+                  </pic:nvPicPr>
+                  <pic:blipFill>
+                    <a:blip r:embed="rId18"/>
+                    <a:stretch>
+                      <a:fillRect/>
+                    </a:stretch>
+                  </pic:blipFill>
+                  <pic:spPr bwMode="auto">
+                    <a:xfrm>
+                      <a:off x="0" y="0"/>
+                      <a:ext cx="2355850" cy="3734435"/>
+                    </a:xfrm>
+                    <a:prstGeom prst="rect">
+                      <a:avLst/>
+                    </a:prstGeom>
+                  </pic:spPr>
+                </pic:pic>
+              </a:graphicData>
+            </a:graphic>
+          </wp:anchor>
+        </w:drawing>
+        <mc:AlternateContent>
+          <mc:Choice Requires="wps">
+            <w:drawing>
+              <wp:anchor behindDoc="0" distT="1270" distB="635" distL="1270" distR="635" simplePos="0" locked="0" layoutInCell="0" allowOverlap="1" relativeHeight="35">
+                <wp:simplePos x="0" y="0"/>
+                <wp:positionH relativeFrom="column">
+                  <wp:posOffset>3752850</wp:posOffset>
+                </wp:positionH>
+                <wp:positionV relativeFrom="paragraph">
+                  <wp:posOffset>83820</wp:posOffset>
+                </wp:positionV>
+                <wp:extent cx="666115" cy="257175"/>
+                <wp:effectExtent l="1270" t="1270" r="635" b="635"/>
+                <wp:wrapNone/>
+                <wp:docPr id="33" name="Shape 7"/>
+                <a:graphic xmlns:a="http://schemas.openxmlformats.org/drawingml/2006/main">
+                  <a:graphicData uri="http://schemas.microsoft.com/office/word/2010/wordprocessingShape">
+                    <wps:wsp>
+                      <wps:cNvSpPr/>
+                      <wps:spPr>
+                        <a:xfrm flipH="1">
+                          <a:off x="0" y="0"/>
+                          <a:ext cx="666000" cy="257040"/>
+                        </a:xfrm>
+                        <a:prstGeom prst="leftArrow">
+                          <a:avLst>
+                            <a:gd name="adj1" fmla="val 50000"/>
+                            <a:gd name="adj2" fmla="val 64776"/>
+                          </a:avLst>
+                        </a:prstGeom>
+                        <a:solidFill>
+                          <a:srgbClr val="729fcf"/>
+                        </a:solidFill>
+                        <a:ln w="0">
+                          <a:solidFill>
+                            <a:srgbClr val="3465a4"/>
+                          </a:solidFill>
+                        </a:ln>
+                      </wps:spPr>
+                      <wps:style>
+                        <a:lnRef idx="0"/>
+                        <a:fillRef idx="0"/>
+                        <a:effectRef idx="0"/>
+                        <a:fontRef idx="minor"/>
+                      </wps:style>
+                      <wps:bodyPr/>
+                    </wps:wsp>
+                  </a:graphicData>
+                </a:graphic>
+              </wp:anchor>
+            </w:drawing>
+          </mc:Choice>
+          <mc:Fallback>
+            <w:pict>
+              <v:shape id="shape_0" ID="Shape 7" path="l-2147483635,0l-2147483635,-2147483631l-2147483624,-2147483631l-2147483624,-2147483629l-2147483635,-2147483629l-2147483635,-2147483623xe" fillcolor="#729fcf" stroked="t" o:allowincell="f" style="position:absolute;margin-left:295.5pt;margin-top:6.6pt;width:52.4pt;height:20.2pt;flip:x;mso-wrap-style:none;v-text-anchor:middle" type="_x0000_t66">
+                <v:fill o:detectmouseclick="t" type="solid" color2="#8d6030"/>
+                <v:stroke color="#3465a4" joinstyle="round" endcap="flat"/>
+                <w10:wrap type="none"/>
+              </v:shape>
+            </w:pict>
+          </mc:Fallback>
+        </mc:AlternateContent>
+      </w:r>
+    </w:p>
+    <w:p>
+      <w:pPr>
+        <w:pStyle w:val="Normal"/>
+        <w:spacing w:before="0" w:after="160"/>
+        <w:rPr>
+          <w:lang w:val="fr-CA"/>
+        </w:rPr>
+      </w:pPr>
+      <w:r>
+        <w:rPr/>
+      </w:r>
+    </w:p>
+    <w:p>
+      <w:pPr>
+        <w:pStyle w:val="Normal"/>
+        <w:spacing w:before="0" w:after="160"/>
+        <w:rPr>
+          <w:lang w:val="fr-CA"/>
+        </w:rPr>
+      </w:pPr>
+      <w:r>
+        <w:rPr/>
+      </w:r>
+    </w:p>
+    <w:p>
+      <w:pPr>
+        <w:pStyle w:val="Heading2"/>
+        <w:rPr>
+          <w:lang w:val="fr-CA"/>
+        </w:rPr>
+      </w:pPr>
+      <w:r>
+        <w:rPr/>
+        <w:t>Déconnection d’un groupe</w:t>
+      </w:r>
+    </w:p>
+    <w:p>
+      <w:pPr>
+        <w:pStyle w:val="Normal"/>
+        <w:spacing w:before="0" w:after="160"/>
+        <w:rPr>
+          <w:lang w:val="fr-CA"/>
+        </w:rPr>
+      </w:pPr>
+      <w:r>
+        <w:rPr/>
+        <w:t xml:space="preserve">Pour se déconnecter d’un groupe appuyer en haut </w:t>
+      </w:r>
+      <w:r>
+        <w:rPr>
+          <w:rFonts w:eastAsia="Calibri" w:cs="" w:cstheme="minorBidi" w:eastAsiaTheme="minorHAnsi"/>
+          <w:color w:val="auto"/>
+          <w:kern w:val="0"/>
+          <w:sz w:val="22"/>
+          <w:szCs w:val="22"/>
+          <w:lang w:val="en-US" w:eastAsia="en-US" w:bidi="ar-SA"/>
+        </w:rPr>
+        <mc:AlternateContent>
+          <mc:Choice Requires="wps">
+            <w:drawing>
+              <wp:anchor behindDoc="0" distT="1270" distB="635" distL="1270" distR="635" simplePos="0" locked="0" layoutInCell="0" allowOverlap="1" relativeHeight="36">
+                <wp:simplePos x="0" y="0"/>
+                <wp:positionH relativeFrom="column">
+                  <wp:posOffset>3914775</wp:posOffset>
+                </wp:positionH>
+                <wp:positionV relativeFrom="paragraph">
+                  <wp:posOffset>1953260</wp:posOffset>
+                </wp:positionV>
+                <wp:extent cx="667385" cy="258445"/>
+                <wp:effectExtent l="1270" t="1270" r="635" b="635"/>
+                <wp:wrapNone/>
+                <wp:docPr id="34" name="Shape 9"/>
+                <a:graphic xmlns:a="http://schemas.openxmlformats.org/drawingml/2006/main">
+                  <a:graphicData uri="http://schemas.microsoft.com/office/word/2010/wordprocessingShape">
+                    <wps:wsp>
+                      <wps:cNvSpPr/>
+                      <wps:spPr>
+                        <a:xfrm flipH="1">
+                          <a:off x="0" y="0"/>
+                          <a:ext cx="667440" cy="258480"/>
+                        </a:xfrm>
+                        <a:prstGeom prst="leftArrow">
+                          <a:avLst>
+                            <a:gd name="adj1" fmla="val 50000"/>
+                            <a:gd name="adj2" fmla="val 64776"/>
+                          </a:avLst>
+                        </a:prstGeom>
+                        <a:solidFill>
+                          <a:srgbClr val="729fcf"/>
+                        </a:solidFill>
+                        <a:ln w="0">
+                          <a:solidFill>
+                            <a:srgbClr val="3465a4"/>
+                          </a:solidFill>
+                        </a:ln>
+                      </wps:spPr>
+                      <wps:style>
+                        <a:lnRef idx="0"/>
+                        <a:fillRef idx="0"/>
+                        <a:effectRef idx="0"/>
+                        <a:fontRef idx="minor"/>
+                      </wps:style>
+                      <wps:bodyPr/>
+                    </wps:wsp>
+                  </a:graphicData>
+                </a:graphic>
+              </wp:anchor>
+            </w:drawing>
+          </mc:Choice>
+          <mc:Fallback>
+            <w:pict>
+              <v:shape id="shape_0" ID="Shape 9" path="l-2147483635,0l-2147483635,-2147483631l-2147483624,-2147483631l-2147483624,-2147483629l-2147483635,-2147483629l-2147483635,-2147483623xe" fillcolor="#729fcf" stroked="t" o:allowincell="f" style="position:absolute;margin-left:308.25pt;margin-top:153.8pt;width:52.5pt;height:20.3pt;flip:x;mso-wrap-style:none;v-text-anchor:middle" type="_x0000_t66">
+                <v:fill o:detectmouseclick="t" type="solid" color2="#8d6030"/>
+                <v:stroke color="#3465a4" joinstyle="round" endcap="flat"/>
+                <w10:wrap type="none"/>
+              </v:shape>
+            </w:pict>
+          </mc:Fallback>
+        </mc:AlternateContent>
+      </w:r>
+      <w:r>
+        <w:rPr>
+          <w:rFonts w:eastAsia="Calibri" w:cs="" w:cstheme="minorBidi" w:eastAsiaTheme="minorHAnsi"/>
+          <w:color w:val="auto"/>
+          <w:kern w:val="0"/>
+          <w:sz w:val="22"/>
+          <w:szCs w:val="22"/>
+          <w:lang w:val="en-US" w:eastAsia="en-US" w:bidi="ar-SA"/>
+        </w:rPr>
+        <w:t>à gauche et appuyer sur se déconnecter de *Nom*.</w:t>
       </w:r>
     </w:p>
     <w:sectPr>
@@ -3576,6 +4091,7 @@
     <w:qFormat/>
     <w:pPr>
       <w:widowControl/>
+      <w:suppressAutoHyphens w:val="true"/>
       <w:bidi w:val="0"/>
       <w:spacing w:lineRule="auto" w:line="259" w:before="0" w:after="160"/>
       <w:jc w:val="left"/>

</xml_diff>